<commit_message>
File Corruption messed everything up
</commit_message>
<xml_diff>
--- a/report/ECM2414 Coursework Report.docx
+++ b/report/ECM2414 Coursework Report.docx
@@ -885,7 +885,15 @@
           <w:sz w:val="22"/>
           <w:szCs w:val="22"/>
         </w:rPr>
-        <w:t>A pack must have exactly 8n rows, each holding one non-negative integer; values greater than n are allowed. Surrounding whitespace, CRLF line endings, trailing blank lines and a UTF-8 byte-order mark are tolerated. Non-integer rows, int overflow, negative values, blank rows in the middle and missing files are rejected with a message (giving the row number for a bad row), and the program asks again until both inputs are valid.</w:t>
+        <w:t xml:space="preserve">A pack must have exactly 8n rows, each holding one non-negative integer; values greater than n are allowed. Surrounding whitespace, CRLF line endings, trailing blank lines and a UTF-8 byte-order mark are tolerated. Non-integer rows, int overflow, negative values, blank rows in the middle and missing files are rejected with a </w:t>
+      </w:r>
+      <w:r>
+        <w:rPr>
+          <w:sz w:val="22"/>
+          <w:szCs w:val="22"/>
+        </w:rPr>
+        <w:lastRenderedPageBreak/>
+        <w:t>message (giving the row number for a bad row), and the program asks again until both inputs are valid.</w:t>
       </w:r>
     </w:p>
     <w:p>
@@ -1421,7 +1429,22 @@
           <w:sz w:val="22"/>
           <w:szCs w:val="22"/>
         </w:rPr>
-        <w:t>TestRunner runs 63 tests in five classes through the JUnit Platform launcher; parameterised tests cover boundary values. Tests check behaviour and invariants through the public API; apart from boundary checks on card values, none simply checks a getter or setter. Each item in the brief is tested:</w:t>
+        <w:lastRenderedPageBreak/>
+        <w:t xml:space="preserve">TestRunner runs </w:t>
+      </w:r>
+      <w:r>
+        <w:rPr>
+          <w:sz w:val="22"/>
+          <w:szCs w:val="22"/>
+        </w:rPr>
+        <w:t>74</w:t>
+      </w:r>
+      <w:r>
+        <w:rPr>
+          <w:sz w:val="22"/>
+          <w:szCs w:val="22"/>
+        </w:rPr>
+        <w:t xml:space="preserve"> tests in five classes through the JUnit Platform launcher; parameterised tests cover boundary values. Tests check behaviour and invariants through the public API; apart from boundary checks on card values, none simply checks a getter or setter. Each item in the brief is tested:</w:t>
       </w:r>
     </w:p>
     <w:p>

</xml_diff>